<commit_message>
Faz script de polling
</commit_message>
<xml_diff>
--- a/contratos/Contrato_746_Biview.docx
+++ b/contratos/Contrato_746_Biview.docx
@@ -2741,7 +2741,7 @@
                 <w:sz w:val="18"/>
                 <w:szCs w:val="18"/>
               </w:rPr>
-              <w:t xml:space="preserve">23/02/2026</w:t>
+              <w:t xml:space="preserve">25/04/2026</w:t>
             </w:r>
           </w:p>
         </w:tc>
@@ -2829,7 +2829,7 @@
                 <w:sz w:val="18"/>
                 <w:szCs w:val="18"/>
               </w:rPr>
-              <w:t xml:space="preserve">23/02/2026</w:t>
+              <w:t xml:space="preserve">25/04/2026</w:t>
             </w:r>
           </w:p>
         </w:tc>
@@ -3385,7 +3385,7 @@
                 <w:sz w:val="20"/>
                 <w:szCs w:val="20"/>
               </w:rPr>
-              <w:t xml:space="preserve"> financeiro@gebras.com</w:t>
+              <w:t xml:space="preserve"> viniciusmoraes454@gmail.com</w:t>
             </w:r>
           </w:p>
         </w:tc>
@@ -3514,7 +3514,7 @@
                 <w:sz w:val="20"/>
                 <w:szCs w:val="20"/>
               </w:rPr>
-              <w:t xml:space="preserve">gestor_gebras@gebras.com</w:t>
+              <w:t xml:space="preserve">hgspop@gmail.com</w:t>
             </w:r>
           </w:p>
         </w:tc>
@@ -3631,7 +3631,7 @@
                 <w:sz w:val="20"/>
                 <w:szCs w:val="20"/>
               </w:rPr>
-              <w:t xml:space="preserve">gestor_contratante@gebras.com</w:t>
+              <w:t xml:space="preserve">viniciusmoraes454@gmail.com</w:t>
             </w:r>
           </w:p>
         </w:tc>

</xml_diff>

<commit_message>
Adiciona configuração inicial do projeto com Docker, arquivos de exemplo e estrutura de diretórios. Inclui .dockerignore, .env.example, e documentação sobre a automação de contratos entre Pipedrive e Clicksign.
</commit_message>
<xml_diff>
--- a/contratos/Contrato_746_Biview.docx
+++ b/contratos/Contrato_746_Biview.docx
@@ -399,7 +399,7 @@
                 <w:b/>
                 <w:bCs/>
               </w:rPr>
-              <w:t xml:space="preserve">Teste testando</w:t>
+              <w:t xml:space="preserve">Viviane Kolmar Bederode</w:t>
             </w:r>
           </w:p>
         </w:tc>
@@ -479,7 +479,7 @@
               <w:rPr>
                 <w:rFonts w:asciiTheme="minorHAnsi" w:hAnsiTheme="minorHAnsi" w:cstheme="minorBidi"/>
               </w:rPr>
-              <w:t xml:space="preserve">Rua 1 do lado da Rua 2</w:t>
+              <w:t xml:space="preserve">Cidinei Alves Dias</w:t>
             </w:r>
           </w:p>
         </w:tc>
@@ -557,7 +557,7 @@
               <w:rPr>
                 <w:rFonts w:asciiTheme="minorHAnsi" w:hAnsiTheme="minorHAnsi" w:cstheme="minorBidi"/>
               </w:rPr>
-              <w:t xml:space="preserve">Testandolândia</w:t>
+              <w:t xml:space="preserve">Pelotas</w:t>
             </w:r>
           </w:p>
         </w:tc>
@@ -655,7 +655,7 @@
               <w:rPr>
                 <w:rFonts w:asciiTheme="minorHAnsi" w:hAnsiTheme="minorHAnsi" w:cstheme="minorBidi"/>
               </w:rPr>
-              <w:t xml:space="preserve">359.696.440-72</w:t>
+              <w:t xml:space="preserve">52.398.605/0001-86</w:t>
             </w:r>
           </w:p>
         </w:tc>
@@ -2741,7 +2741,7 @@
                 <w:sz w:val="18"/>
                 <w:szCs w:val="18"/>
               </w:rPr>
-              <w:t xml:space="preserve">25/04/2026</w:t>
+              <w:t xml:space="preserve">14/05/2026</w:t>
             </w:r>
           </w:p>
         </w:tc>
@@ -2829,7 +2829,7 @@
                 <w:sz w:val="18"/>
                 <w:szCs w:val="18"/>
               </w:rPr>
-              <w:t xml:space="preserve">25/04/2026</w:t>
+              <w:t xml:space="preserve">14/05/2026</w:t>
             </w:r>
           </w:p>
         </w:tc>

</xml_diff>

<commit_message>
Atualiza configuração e documentação da automação de contratos. Adiciona variáveis ao .env.example para desenvolvimento, detalha o uso da variável DEV_PULAR_CLICKSIGN na documentação, e inclui novos campos no contrato e na lógica de pedidos no Plune. Melhora a estrutura do código com novas funções de validação e gerenciamento de estado.
</commit_message>
<xml_diff>
--- a/contratos/Contrato_746_Biview.docx
+++ b/contratos/Contrato_746_Biview.docx
@@ -399,7 +399,7 @@
                 <w:b/>
                 <w:bCs/>
               </w:rPr>
-              <w:t xml:space="preserve">Viviane Kolmar Bederode</w:t>
+              <w:t xml:space="preserve">BIView</w:t>
             </w:r>
           </w:p>
         </w:tc>
@@ -2197,7 +2197,7 @@
                 <w:sz w:val="18"/>
                 <w:szCs w:val="18"/>
               </w:rPr>
-              <w:t xml:space="preserve">30</w:t>
+              <w:t xml:space="preserve">5</w:t>
             </w:r>
           </w:p>
         </w:tc>
@@ -2337,7 +2337,7 @@
                 <w:sz w:val="18"/>
                 <w:szCs w:val="18"/>
               </w:rPr>
-              <w:t xml:space="preserve">333</w:t>
+              <w:t xml:space="preserve">6</w:t>
             </w:r>
           </w:p>
         </w:tc>
@@ -2468,7 +2468,7 @@
                 <w:sz w:val="18"/>
                 <w:szCs w:val="18"/>
               </w:rPr>
-              <w:t xml:space="preserve">R$ 3.000,00</w:t>
+              <w:t xml:space="preserve">R$ 3,00</w:t>
             </w:r>
           </w:p>
         </w:tc>
@@ -2741,7 +2741,7 @@
                 <w:sz w:val="18"/>
                 <w:szCs w:val="18"/>
               </w:rPr>
-              <w:t xml:space="preserve">14/05/2026</w:t>
+              <w:t xml:space="preserve">15/05/2026</w:t>
             </w:r>
           </w:p>
         </w:tc>
@@ -2829,7 +2829,7 @@
                 <w:sz w:val="18"/>
                 <w:szCs w:val="18"/>
               </w:rPr>
-              <w:t xml:space="preserve">14/05/2026</w:t>
+              <w:t xml:space="preserve">15/05/2026</w:t>
             </w:r>
           </w:p>
         </w:tc>

</xml_diff>

<commit_message>
Remove variável DEV_PLUNE_APROVADO_NAO do .env.example e do código. Atualiza o contrato padrão com novos números de pedidos e corrige a data de início e término. Implementa novas funções para gerenciar templates de contratos e anexa documentos de forma mais eficiente, além de garantir que os deals sejam movidos para a etapa de Negociação no Pipedrive.
</commit_message>
<xml_diff>
--- a/contratos/Contrato_746_Biview.docx
+++ b/contratos/Contrato_746_Biview.docx
@@ -19,8 +19,8 @@
       <w:tblGrid>
         <w:gridCol w:w="3208"/>
         <w:gridCol w:w="1232"/>
-        <w:gridCol w:w="4292"/>
-        <w:gridCol w:w="1334"/>
+        <w:gridCol w:w="4293"/>
+        <w:gridCol w:w="1333"/>
       </w:tblGrid>
       <w:tr>
         <w:trPr>
@@ -124,7 +124,16 @@
                 <w:sz w:val="24"/>
                 <w:szCs w:val="24"/>
               </w:rPr>
-              <w:t>CONTRATO DE PRESTAÇÃO DE SERVIÇOS DE GESTÃO DE ENERGIA</w:t>
+              <w:t xml:space="preserve">CONTRATO DE PRESTAÇÃO DE SERVIÇOS DE GESTÃO DE ENERGIA </w:t>
+            </w:r>
+            <w:r>
+              <w:rPr>
+                <w:rFonts w:cs="Calibri" w:ascii="Calibri" w:hAnsi="Calibri" w:asciiTheme="minorHAnsi" w:cstheme="minorHAnsi" w:hAnsiTheme="minorHAnsi"/>
+                <w:b/>
+                <w:sz w:val="24"/>
+                <w:szCs w:val="24"/>
+              </w:rPr>
+              <w:t>teste teeste</w:t>
             </w:r>
           </w:p>
         </w:tc>
@@ -185,17 +194,11 @@
               </w:rPr>
               <w:t>Nº Contrato:</w:t>
             </w:r>
-            <w:r>
-              <w:rPr>
-                <w:rFonts w:cs="Calibri" w:ascii="Calibri" w:hAnsi="Calibri" w:asciiTheme="minorHAnsi" w:cstheme="minorHAnsi" w:hAnsiTheme="minorHAnsi"/>
-              </w:rPr>
-              <w:t xml:space="preserve"> </w:t>
-            </w:r>
           </w:p>
         </w:tc>
         <w:tc>
           <w:tcPr>
-            <w:tcW w:w="4292" w:type="dxa"/>
+            <w:tcW w:w="4293" w:type="dxa"/>
             <w:tcBorders>
               <w:top w:val="single" w:sz="2" w:space="0" w:color="000000"/>
               <w:bottom w:val="single" w:sz="2" w:space="0" w:color="000000"/>
@@ -227,7 +230,7 @@
         </w:tc>
         <w:tc>
           <w:tcPr>
-            <w:tcW w:w="1334" w:type="dxa"/>
+            <w:tcW w:w="1333" w:type="dxa"/>
             <w:tcBorders>
               <w:bottom w:val="single" w:sz="2" w:space="0" w:color="000000"/>
               <w:right w:val="single" w:sz="18" w:space="0" w:color="000000"/>
@@ -307,15 +310,7 @@
                 <w:b/>
                 <w:bCs/>
               </w:rPr>
-              <w:t xml:space="preserve">Nº Pedido Plune: </w:t>
-            </w:r>
-            <w:r>
-              <w:rPr>
-                <w:rFonts w:cs="Calibri" w:ascii="Calibri" w:hAnsi="Calibri" w:asciiTheme="minorHAnsi" w:cstheme="minorHAnsi" w:hAnsiTheme="minorHAnsi"/>
-                <w:b/>
-                <w:bCs/>
-              </w:rPr>
-              <w:t xml:space="preserve">Implantação: 6799 | Recorrente: 6800</w:t>
+              <w:t xml:space="preserve">Nº Pedido Plune: Implantação: 6821 | Recorrente: 6822</w:t>
             </w:r>
           </w:p>
         </w:tc>
@@ -546,7 +541,7 @@
                 <w:b/>
                 <w:bCs/>
               </w:rPr>
-              <w:t xml:space="preserve">1.2 Endereço:</w:t>
+              <w:t>1.2 Endereço:</w:t>
             </w:r>
           </w:p>
         </w:tc>
@@ -718,7 +713,7 @@
                 <w:b/>
                 <w:bCs/>
               </w:rPr>
-              <w:t xml:space="preserve">1.5 Inscrição Estadual:</w:t>
+              <w:t>1.5 Inscrição Estadual:</w:t>
             </w:r>
           </w:p>
         </w:tc>
@@ -839,8 +834,8 @@
         <w:tblLook w:firstRow="1" w:noVBand="1" w:lastRow="0" w:firstColumn="1" w:lastColumn="0" w:noHBand="0" w:val="04a0"/>
       </w:tblPr>
       <w:tblGrid>
-        <w:gridCol w:w="2179"/>
-        <w:gridCol w:w="1971"/>
+        <w:gridCol w:w="2178"/>
+        <w:gridCol w:w="1972"/>
         <w:gridCol w:w="930"/>
         <w:gridCol w:w="4983"/>
       </w:tblGrid>
@@ -850,7 +845,7 @@
         </w:trPr>
         <w:tc>
           <w:tcPr>
-            <w:tcW w:w="2179" w:type="dxa"/>
+            <w:tcW w:w="2178" w:type="dxa"/>
             <w:tcBorders>
               <w:top w:val="single" w:sz="18" w:space="0" w:color="000000"/>
               <w:left w:val="single" w:sz="18" w:space="0" w:color="000000"/>
@@ -878,7 +873,7 @@
         </w:tc>
         <w:tc>
           <w:tcPr>
-            <w:tcW w:w="7884" w:type="dxa"/>
+            <w:tcW w:w="7885" w:type="dxa"/>
             <w:gridSpan w:val="3"/>
             <w:tcBorders>
               <w:top w:val="single" w:sz="18" w:space="0" w:color="000000"/>
@@ -913,7 +908,7 @@
         </w:trPr>
         <w:tc>
           <w:tcPr>
-            <w:tcW w:w="2179" w:type="dxa"/>
+            <w:tcW w:w="2178" w:type="dxa"/>
             <w:tcBorders>
               <w:top w:val="single" w:sz="8" w:space="0" w:color="000000"/>
               <w:left w:val="single" w:sz="18" w:space="0" w:color="000000"/>
@@ -943,7 +938,7 @@
         </w:tc>
         <w:tc>
           <w:tcPr>
-            <w:tcW w:w="7884" w:type="dxa"/>
+            <w:tcW w:w="7885" w:type="dxa"/>
             <w:gridSpan w:val="3"/>
             <w:tcBorders>
               <w:top w:val="single" w:sz="8" w:space="0" w:color="000000"/>
@@ -978,7 +973,7 @@
         </w:trPr>
         <w:tc>
           <w:tcPr>
-            <w:tcW w:w="2179" w:type="dxa"/>
+            <w:tcW w:w="2178" w:type="dxa"/>
             <w:tcBorders>
               <w:top w:val="single" w:sz="4" w:space="0" w:color="000000"/>
               <w:left w:val="single" w:sz="18" w:space="0" w:color="000000"/>
@@ -1006,7 +1001,7 @@
         </w:tc>
         <w:tc>
           <w:tcPr>
-            <w:tcW w:w="7884" w:type="dxa"/>
+            <w:tcW w:w="7885" w:type="dxa"/>
             <w:gridSpan w:val="3"/>
             <w:tcBorders>
               <w:top w:val="single" w:sz="4" w:space="0" w:color="000000"/>
@@ -1037,7 +1032,7 @@
         </w:trPr>
         <w:tc>
           <w:tcPr>
-            <w:tcW w:w="2179" w:type="dxa"/>
+            <w:tcW w:w="2178" w:type="dxa"/>
             <w:tcBorders>
               <w:left w:val="single" w:sz="18" w:space="0" w:color="000000"/>
               <w:bottom w:val="single" w:sz="18" w:space="0" w:color="000000"/>
@@ -1064,7 +1059,7 @@
         </w:tc>
         <w:tc>
           <w:tcPr>
-            <w:tcW w:w="1971" w:type="dxa"/>
+            <w:tcW w:w="1972" w:type="dxa"/>
             <w:tcBorders>
               <w:bottom w:val="single" w:sz="18" w:space="0" w:color="000000"/>
               <w:right w:val="single" w:sz="8" w:space="0" w:color="000000"/>
@@ -1259,7 +1254,15 @@
                 <w:sz w:val="18"/>
                 <w:szCs w:val="18"/>
               </w:rPr>
-              <w:t>”, e serão prestados nas UCs do CONTRATANTE conforme descrito no item 4 a seguir.</w:t>
+              <w:t xml:space="preserve">”, e serão prestados nas UCs do CONTRATANTE conforme descrito no item 4 a seguir. </w:t>
+            </w:r>
+            <w:r>
+              <w:rPr>
+                <w:rFonts w:cs="Calibri" w:ascii="Calibri" w:hAnsi="Calibri" w:asciiTheme="minorHAnsi" w:cstheme="minorHAnsi" w:hAnsiTheme="minorHAnsi"/>
+                <w:sz w:val="18"/>
+                <w:szCs w:val="18"/>
+              </w:rPr>
+              <w:t>testesteteste</w:t>
             </w:r>
           </w:p>
         </w:tc>
@@ -2098,7 +2101,7 @@
                 <w:sz w:val="18"/>
                 <w:szCs w:val="18"/>
               </w:rPr>
-              <w:t xml:space="preserve">R$ 789,00</w:t>
+              <w:t xml:space="preserve">R$ 1.300,00</w:t>
             </w:r>
           </w:p>
         </w:tc>
@@ -2216,7 +2219,7 @@
                 <w:sz w:val="18"/>
                 <w:szCs w:val="18"/>
               </w:rPr>
-              <w:t xml:space="preserve">R$ 7.000,00</w:t>
+              <w:t xml:space="preserve">R$ 4.000,00</w:t>
             </w:r>
           </w:p>
         </w:tc>
@@ -2330,11 +2333,11 @@
             </w:pPr>
             <w:r>
               <w:rPr>
-                <w:rFonts w:cs="" w:cstheme="minorBidi" w:ascii="Calibri" w:hAnsi="Calibri"/>
-                <w:sz w:val="18"/>
-                <w:szCs w:val="18"/>
-              </w:rPr>
-              <w:t xml:space="preserve">15%</w:t>
+                <w:rFonts w:cs="" w:ascii="Calibri" w:hAnsi="Calibri" w:cstheme="minorBidi"/>
+                <w:sz w:val="18"/>
+                <w:szCs w:val="18"/>
+              </w:rPr>
+              <w:t xml:space="preserve">40%</w:t>
             </w:r>
           </w:p>
         </w:tc>
@@ -2465,7 +2468,7 @@
               <w:rPr>
                 <w:rFonts w:cs="" w:cstheme="minorBidi"/>
               </w:rPr>
-              <w:t xml:space="preserve">26/05/2026</w:t>
+              <w:t xml:space="preserve">28/05/2026</w:t>
             </w:r>
           </w:p>
         </w:tc>
@@ -2533,7 +2536,7 @@
                 <w:sz w:val="18"/>
                 <w:szCs w:val="18"/>
               </w:rPr>
-              <w:t xml:space="preserve">26/05/2026</w:t>
+              <w:t xml:space="preserve">28/05/2026</w:t>
             </w:r>
           </w:p>
         </w:tc>
@@ -7292,6 +7295,7 @@
             <w:pPr>
               <w:pStyle w:val="Normal"/>
               <w:widowControl/>
+              <w:suppressAutoHyphens w:val="true"/>
               <w:spacing w:before="60" w:after="60"/>
               <w:ind w:right="-1"/>
               <w:jc w:val="both"/>
@@ -7331,6 +7335,7 @@
             <w:pPr>
               <w:pStyle w:val="Normal"/>
               <w:widowControl/>
+              <w:suppressAutoHyphens w:val="true"/>
               <w:spacing w:before="60" w:after="60"/>
               <w:ind w:right="-1"/>
               <w:jc w:val="both"/>
@@ -7344,13 +7349,11 @@
             </w:pPr>
             <w:r>
               <w:rPr>
-                <w:rFonts w:eastAsia="Times New Roman" w:cs="Calibri" w:cstheme="minorHAnsi" w:ascii="Calibri" w:hAnsi="Calibri"/>
+                <w:rFonts w:cs="Calibri" w:cstheme="minorHAnsi" w:ascii="Calibri" w:hAnsi="Calibri"/>
                 <w:b/>
                 <w:bCs/>
-                <w:kern w:val="0"/>
-                <w:sz w:val="18"/>
-                <w:szCs w:val="18"/>
-                <w:lang w:val="pt-BR" w:eastAsia="pt-BR" w:bidi="ar-SA"/>
+                <w:sz w:val="18"/>
+                <w:szCs w:val="18"/>
               </w:rPr>
             </w:r>
           </w:p>
@@ -7367,6 +7370,7 @@
             <w:pPr>
               <w:pStyle w:val="Normal"/>
               <w:widowControl/>
+              <w:suppressAutoHyphens w:val="true"/>
               <w:spacing w:before="60" w:after="60"/>
               <w:ind w:right="-1"/>
               <w:jc w:val="both"/>
@@ -7408,6 +7412,7 @@
             <w:pPr>
               <w:pStyle w:val="Normal"/>
               <w:widowControl/>
+              <w:suppressAutoHyphens w:val="true"/>
               <w:spacing w:before="0" w:after="0"/>
               <w:jc w:val="both"/>
               <w:rPr>
@@ -7431,6 +7436,7 @@
             <w:pPr>
               <w:pStyle w:val="Normal"/>
               <w:widowControl/>
+              <w:suppressAutoHyphens w:val="true"/>
               <w:spacing w:before="0" w:after="0"/>
               <w:jc w:val="both"/>
               <w:rPr>
@@ -7465,6 +7471,7 @@
             <w:pPr>
               <w:pStyle w:val="Normal"/>
               <w:widowControl/>
+              <w:suppressAutoHyphens w:val="true"/>
               <w:spacing w:before="0" w:after="0"/>
               <w:jc w:val="both"/>
               <w:rPr>
@@ -7475,11 +7482,9 @@
             </w:pPr>
             <w:r>
               <w:rPr>
-                <w:rFonts w:eastAsia="Times New Roman" w:cs="Calibri" w:cstheme="minorHAnsi" w:ascii="Calibri" w:hAnsi="Calibri"/>
-                <w:kern w:val="0"/>
-                <w:sz w:val="18"/>
-                <w:szCs w:val="18"/>
-                <w:lang w:val="pt-BR" w:eastAsia="pt-BR" w:bidi="ar-SA"/>
+                <w:rFonts w:cs="Calibri" w:cstheme="minorHAnsi" w:ascii="Calibri" w:hAnsi="Calibri"/>
+                <w:sz w:val="18"/>
+                <w:szCs w:val="18"/>
               </w:rPr>
             </w:r>
           </w:p>
@@ -7497,6 +7502,7 @@
             <w:pPr>
               <w:pStyle w:val="Normal"/>
               <w:widowControl/>
+              <w:suppressAutoHyphens w:val="true"/>
               <w:spacing w:before="0" w:after="0"/>
               <w:jc w:val="both"/>
               <w:rPr>
@@ -7520,6 +7526,7 @@
             <w:pPr>
               <w:pStyle w:val="Normal"/>
               <w:widowControl/>
+              <w:suppressAutoHyphens w:val="true"/>
               <w:spacing w:before="0" w:after="0"/>
               <w:jc w:val="both"/>
               <w:rPr>
@@ -9092,966 +9099,6 @@
           <w:rFonts w:ascii="Calibri" w:hAnsi="Calibri" w:cs="Calibri" w:asciiTheme="minorHAnsi" w:cstheme="minorHAnsi" w:hAnsiTheme="minorHAnsi"/>
           <w:sz w:val="18"/>
           <w:szCs w:val="18"/>
-        </w:rPr>
-      </w:pPr>
-      <w:r>
-        <w:rPr>
-          <w:rFonts w:cs="Calibri" w:cstheme="minorHAnsi" w:ascii="Calibri" w:hAnsi="Calibri"/>
-          <w:sz w:val="18"/>
-          <w:szCs w:val="18"/>
-        </w:rPr>
-      </w:r>
-    </w:p>
-    <w:p>
-      <w:pPr>
-        <w:pStyle w:val="Normal"/>
-        <w:rPr>
-          <w:rFonts w:ascii="Calibri" w:hAnsi="Calibri" w:cs="Calibri" w:asciiTheme="minorHAnsi" w:cstheme="minorHAnsi" w:hAnsiTheme="minorHAnsi"/>
-          <w:sz w:val="18"/>
-          <w:szCs w:val="18"/>
-        </w:rPr>
-      </w:pPr>
-      <w:r>
-        <w:rPr>
-          <w:rFonts w:cs="Calibri" w:cstheme="minorHAnsi" w:ascii="Calibri" w:hAnsi="Calibri"/>
-          <w:sz w:val="18"/>
-          <w:szCs w:val="18"/>
-        </w:rPr>
-      </w:r>
-    </w:p>
-    <w:p>
-      <w:pPr>
-        <w:pStyle w:val="Normal"/>
-        <w:shd w:val="clear" w:color="auto" w:fill="000000" w:themeFill="text1"/>
-        <w:spacing w:before="60" w:after="60"/>
-        <w:ind w:right="-1"/>
-        <w:jc w:val="center"/>
-        <w:rPr>
-          <w:rFonts w:ascii="Calibri" w:hAnsi="Calibri" w:cs="Calibri" w:asciiTheme="minorHAnsi" w:cstheme="minorHAnsi" w:hAnsiTheme="minorHAnsi"/>
-          <w:b/>
-        </w:rPr>
-      </w:pPr>
-      <w:r>
-        <w:rPr>
-          <w:rFonts w:cs="Calibri" w:ascii="Calibri" w:hAnsi="Calibri" w:asciiTheme="minorHAnsi" w:cstheme="minorHAnsi" w:hAnsiTheme="minorHAnsi"/>
-          <w:b/>
-        </w:rPr>
-        <w:t>ANEXO II</w:t>
-      </w:r>
-    </w:p>
-    <w:p>
-      <w:pPr>
-        <w:pStyle w:val="Normal"/>
-        <w:tabs>
-          <w:tab w:val="clear" w:pos="708"/>
-          <w:tab w:val="left" w:pos="284" w:leader="none"/>
-        </w:tabs>
-        <w:jc w:val="both"/>
-        <w:rPr>
-          <w:rFonts w:ascii="Calibri" w:hAnsi="Calibri" w:cs="Calibri" w:asciiTheme="minorHAnsi" w:cstheme="minorHAnsi" w:hAnsiTheme="minorHAnsi"/>
-          <w:sz w:val="14"/>
-          <w:szCs w:val="14"/>
-        </w:rPr>
-      </w:pPr>
-      <w:r>
-        <w:rPr>
-          <w:rFonts w:cs="Calibri" w:cstheme="minorHAnsi" w:ascii="Calibri" w:hAnsi="Calibri"/>
-          <w:sz w:val="14"/>
-          <w:szCs w:val="14"/>
-        </w:rPr>
-      </w:r>
-    </w:p>
-    <w:p>
-      <w:pPr>
-        <w:pStyle w:val="Normal"/>
-        <w:tabs>
-          <w:tab w:val="clear" w:pos="708"/>
-          <w:tab w:val="left" w:pos="284" w:leader="none"/>
-        </w:tabs>
-        <w:jc w:val="both"/>
-        <w:rPr>
-          <w:rFonts w:ascii="Calibri" w:hAnsi="Calibri" w:cs="Calibri" w:asciiTheme="minorHAnsi" w:cstheme="minorHAnsi" w:hAnsiTheme="minorHAnsi"/>
-          <w:sz w:val="14"/>
-          <w:szCs w:val="14"/>
-        </w:rPr>
-      </w:pPr>
-      <w:r>
-        <w:rPr>
-          <w:rFonts w:cs="Calibri" w:cstheme="minorHAnsi" w:ascii="Calibri" w:hAnsi="Calibri"/>
-          <w:sz w:val="14"/>
-          <w:szCs w:val="14"/>
-        </w:rPr>
-      </w:r>
-    </w:p>
-    <w:tbl>
-      <w:tblPr>
-        <w:tblStyle w:val="TabeladeGrade1Clara"/>
-        <w:tblW w:w="5382" w:type="dxa"/>
-        <w:jc w:val="left"/>
-        <w:tblInd w:w="0" w:type="dxa"/>
-        <w:tblLayout w:type="fixed"/>
-        <w:tblCellMar>
-          <w:top w:w="0" w:type="dxa"/>
-          <w:left w:w="108" w:type="dxa"/>
-          <w:bottom w:w="0" w:type="dxa"/>
-          <w:right w:w="108" w:type="dxa"/>
-        </w:tblCellMar>
-        <w:tblLook w:firstRow="1" w:noVBand="1" w:lastRow="0" w:firstColumn="1" w:lastColumn="0" w:noHBand="0" w:val="04a0"/>
-      </w:tblPr>
-      <w:tblGrid>
-        <w:gridCol w:w="2546"/>
-        <w:gridCol w:w="2835"/>
-      </w:tblGrid>
-      <w:tr>
-        <w:trPr>
-          <w:trHeight w:val="288" w:hRule="atLeast"/>
-          <w:cnfStyle w:val="100000000000" w:firstRow="1" w:lastRow="0" w:firstColumn="0" w:lastColumn="0" w:oddVBand="0" w:evenVBand="0" w:oddHBand="0" w:evenHBand="0" w:firstRowFirstColumn="0" w:firstRowLastColumn="0" w:lastRowFirstColumn="0" w:lastRowLastColumn="0"/>
-        </w:trPr>
-        <w:tc>
-          <w:tcPr>
-            <w:tcW w:w="2546" w:type="dxa"/>
-            <w:cnfStyle w:val="001000000000" w:firstRow="0" w:lastRow="0" w:firstColumn="1" w:lastColumn="0" w:oddVBand="0" w:evenVBand="0" w:oddHBand="0" w:evenHBand="0" w:firstRowFirstColumn="0" w:firstRowLastColumn="0" w:lastRowFirstColumn="0" w:lastRowLastColumn="0"/>
-            <w:tcBorders>
-              <w:bottom w:val="single" w:sz="12" w:space="0" w:color="666666"/>
-            </w:tcBorders>
-          </w:tcPr>
-          <w:p>
-            <w:pPr>
-              <w:pStyle w:val="Normal"/>
-              <w:widowControl/>
-              <w:spacing w:before="0" w:after="0"/>
-              <w:jc w:val="center"/>
-              <w:rPr>
-                <w:rFonts w:ascii="Calibri" w:hAnsi="Calibri" w:cs="Calibri" w:asciiTheme="minorHAnsi" w:cstheme="minorHAnsi" w:hAnsiTheme="minorHAnsi"/>
-                <w:color w:val="000000"/>
-                <w:sz w:val="18"/>
-                <w:szCs w:val="18"/>
-              </w:rPr>
-            </w:pPr>
-            <w:r>
-              <w:rPr>
-                <w:rFonts w:eastAsia="Times New Roman" w:cs="Calibri" w:ascii="Calibri" w:hAnsi="Calibri" w:asciiTheme="minorHAnsi" w:cstheme="minorHAnsi" w:hAnsiTheme="minorHAnsi"/>
-                <w:b/>
-                <w:bCs/>
-                <w:color w:val="000000"/>
-                <w:kern w:val="0"/>
-                <w:sz w:val="18"/>
-                <w:szCs w:val="18"/>
-                <w:lang w:val="pt-BR" w:eastAsia="pt-BR" w:bidi="ar-SA"/>
-              </w:rPr>
-              <w:t>UC</w:t>
-            </w:r>
-          </w:p>
-        </w:tc>
-        <w:tc>
-          <w:tcPr>
-            <w:tcW w:w="2835" w:type="dxa"/>
-            <w:tcBorders>
-              <w:bottom w:val="single" w:sz="12" w:space="0" w:color="666666"/>
-            </w:tcBorders>
-          </w:tcPr>
-          <w:p>
-            <w:pPr>
-              <w:pStyle w:val="Normal"/>
-              <w:widowControl/>
-              <w:spacing w:before="0" w:after="0"/>
-              <w:jc w:val="center"/>
-              <w:cnfStyle w:val="100000000000" w:firstRow="1" w:lastRow="0" w:firstColumn="0" w:lastColumn="0" w:oddVBand="0" w:evenVBand="0" w:oddHBand="0" w:evenHBand="0" w:firstRowFirstColumn="0" w:firstRowLastColumn="0" w:lastRowFirstColumn="0" w:lastRowLastColumn="0"/>
-              <w:rPr>
-                <w:rFonts w:ascii="Calibri" w:hAnsi="Calibri" w:cs="Calibri" w:asciiTheme="minorHAnsi" w:cstheme="minorHAnsi" w:hAnsiTheme="minorHAnsi"/>
-                <w:color w:val="000000"/>
-                <w:sz w:val="18"/>
-                <w:szCs w:val="18"/>
-              </w:rPr>
-            </w:pPr>
-            <w:r>
-              <w:rPr>
-                <w:rFonts w:eastAsia="Times New Roman" w:cs="Calibri" w:ascii="Calibri" w:hAnsi="Calibri" w:asciiTheme="minorHAnsi" w:cstheme="minorHAnsi" w:hAnsiTheme="minorHAnsi"/>
-                <w:b/>
-                <w:bCs/>
-                <w:color w:val="000000"/>
-                <w:kern w:val="0"/>
-                <w:sz w:val="18"/>
-                <w:szCs w:val="18"/>
-                <w:lang w:val="pt-BR" w:eastAsia="pt-BR" w:bidi="ar-SA"/>
-              </w:rPr>
-              <w:t>SERVIÇO</w:t>
-            </w:r>
-          </w:p>
-        </w:tc>
-      </w:tr>
-      <w:tr>
-        <w:trPr>
-          <w:trHeight w:val="288" w:hRule="atLeast"/>
-        </w:trPr>
-        <w:tc>
-          <w:tcPr>
-            <w:tcW w:w="2546" w:type="dxa"/>
-            <w:cnfStyle w:val="001000000000" w:firstRow="0" w:lastRow="0" w:firstColumn="1" w:lastColumn="0" w:oddVBand="0" w:evenVBand="0" w:oddHBand="0" w:evenHBand="0" w:firstRowFirstColumn="0" w:firstRowLastColumn="0" w:lastRowFirstColumn="0" w:lastRowLastColumn="0"/>
-            <w:tcBorders/>
-          </w:tcPr>
-          <w:p>
-            <w:pPr>
-              <w:pStyle w:val="Normal"/>
-              <w:widowControl/>
-              <w:spacing w:before="0" w:after="0"/>
-              <w:jc w:val="center"/>
-              <w:rPr>
-                <w:rFonts w:ascii="Calibri" w:hAnsi="Calibri" w:cs="Calibri" w:asciiTheme="minorHAnsi" w:cstheme="minorHAnsi" w:hAnsiTheme="minorHAnsi"/>
-                <w:color w:val="000000"/>
-                <w:sz w:val="18"/>
-                <w:szCs w:val="18"/>
-              </w:rPr>
-            </w:pPr>
-            <w:r>
-              <w:rPr>
-                <w:rFonts w:eastAsia="Times New Roman" w:cs="Calibri" w:cstheme="minorHAnsi" w:ascii="Calibri" w:hAnsi="Calibri"/>
-                <w:b/>
-                <w:bCs/>
-                <w:color w:val="000000"/>
-                <w:kern w:val="0"/>
-                <w:sz w:val="18"/>
-                <w:szCs w:val="18"/>
-                <w:lang w:val="pt-BR" w:eastAsia="pt-BR" w:bidi="ar-SA"/>
-              </w:rPr>
-            </w:r>
-          </w:p>
-        </w:tc>
-        <w:tc>
-          <w:tcPr>
-            <w:tcW w:w="2835" w:type="dxa"/>
-            <w:tcBorders/>
-          </w:tcPr>
-          <w:p>
-            <w:pPr>
-              <w:pStyle w:val="Normal"/>
-              <w:widowControl/>
-              <w:spacing w:before="0" w:after="0"/>
-              <w:jc w:val="center"/>
-              <w:cnfStyle w:val="000000000000" w:firstRow="0" w:lastRow="0" w:firstColumn="0" w:lastColumn="0" w:oddVBand="0" w:evenVBand="0" w:oddHBand="0" w:evenHBand="0" w:firstRowFirstColumn="0" w:firstRowLastColumn="0" w:lastRowFirstColumn="0" w:lastRowLastColumn="0"/>
-              <w:rPr>
-                <w:rFonts w:ascii="Calibri" w:hAnsi="Calibri" w:cs="Calibri" w:asciiTheme="minorHAnsi" w:cstheme="minorHAnsi" w:hAnsiTheme="minorHAnsi"/>
-                <w:color w:val="000000"/>
-                <w:sz w:val="18"/>
-                <w:szCs w:val="18"/>
-              </w:rPr>
-            </w:pPr>
-            <w:r>
-              <w:rPr>
-                <w:rFonts w:eastAsia="Times New Roman" w:cs="Calibri" w:cstheme="minorHAnsi" w:ascii="Calibri" w:hAnsi="Calibri"/>
-                <w:color w:val="000000"/>
-                <w:kern w:val="0"/>
-                <w:sz w:val="18"/>
-                <w:szCs w:val="18"/>
-                <w:lang w:val="pt-BR" w:eastAsia="pt-BR" w:bidi="ar-SA"/>
-              </w:rPr>
-            </w:r>
-          </w:p>
-        </w:tc>
-      </w:tr>
-      <w:tr>
-        <w:trPr>
-          <w:trHeight w:val="288" w:hRule="atLeast"/>
-        </w:trPr>
-        <w:tc>
-          <w:tcPr>
-            <w:tcW w:w="2546" w:type="dxa"/>
-            <w:cnfStyle w:val="001000000000" w:firstRow="0" w:lastRow="0" w:firstColumn="1" w:lastColumn="0" w:oddVBand="0" w:evenVBand="0" w:oddHBand="0" w:evenHBand="0" w:firstRowFirstColumn="0" w:firstRowLastColumn="0" w:lastRowFirstColumn="0" w:lastRowLastColumn="0"/>
-            <w:tcBorders/>
-          </w:tcPr>
-          <w:p>
-            <w:pPr>
-              <w:pStyle w:val="Normal"/>
-              <w:widowControl/>
-              <w:spacing w:before="0" w:after="0"/>
-              <w:jc w:val="center"/>
-              <w:rPr>
-                <w:rFonts w:ascii="Calibri" w:hAnsi="Calibri" w:cs="Calibri" w:asciiTheme="minorHAnsi" w:cstheme="minorHAnsi" w:hAnsiTheme="minorHAnsi"/>
-                <w:color w:val="000000"/>
-                <w:sz w:val="18"/>
-                <w:szCs w:val="18"/>
-              </w:rPr>
-            </w:pPr>
-            <w:r>
-              <w:rPr>
-                <w:rFonts w:eastAsia="Times New Roman" w:cs="Calibri" w:cstheme="minorHAnsi" w:ascii="Calibri" w:hAnsi="Calibri"/>
-                <w:b/>
-                <w:bCs/>
-                <w:color w:val="000000"/>
-                <w:kern w:val="0"/>
-                <w:sz w:val="18"/>
-                <w:szCs w:val="18"/>
-                <w:lang w:val="pt-BR" w:eastAsia="pt-BR" w:bidi="ar-SA"/>
-              </w:rPr>
-            </w:r>
-          </w:p>
-        </w:tc>
-        <w:tc>
-          <w:tcPr>
-            <w:tcW w:w="2835" w:type="dxa"/>
-            <w:tcBorders/>
-          </w:tcPr>
-          <w:p>
-            <w:pPr>
-              <w:pStyle w:val="Normal"/>
-              <w:widowControl/>
-              <w:spacing w:before="0" w:after="0"/>
-              <w:jc w:val="center"/>
-              <w:cnfStyle w:val="000000000000" w:firstRow="0" w:lastRow="0" w:firstColumn="0" w:lastColumn="0" w:oddVBand="0" w:evenVBand="0" w:oddHBand="0" w:evenHBand="0" w:firstRowFirstColumn="0" w:firstRowLastColumn="0" w:lastRowFirstColumn="0" w:lastRowLastColumn="0"/>
-              <w:rPr>
-                <w:rFonts w:ascii="Calibri" w:hAnsi="Calibri" w:cs="Calibri" w:asciiTheme="minorHAnsi" w:cstheme="minorHAnsi" w:hAnsiTheme="minorHAnsi"/>
-                <w:color w:val="000000"/>
-                <w:sz w:val="18"/>
-                <w:szCs w:val="18"/>
-              </w:rPr>
-            </w:pPr>
-            <w:r>
-              <w:rPr>
-                <w:rFonts w:eastAsia="Times New Roman" w:cs="Calibri" w:cstheme="minorHAnsi" w:ascii="Calibri" w:hAnsi="Calibri"/>
-                <w:color w:val="000000"/>
-                <w:kern w:val="0"/>
-                <w:sz w:val="18"/>
-                <w:szCs w:val="18"/>
-                <w:lang w:val="pt-BR" w:eastAsia="pt-BR" w:bidi="ar-SA"/>
-              </w:rPr>
-            </w:r>
-          </w:p>
-        </w:tc>
-      </w:tr>
-      <w:tr>
-        <w:trPr>
-          <w:trHeight w:val="288" w:hRule="atLeast"/>
-        </w:trPr>
-        <w:tc>
-          <w:tcPr>
-            <w:tcW w:w="2546" w:type="dxa"/>
-            <w:cnfStyle w:val="001000000000" w:firstRow="0" w:lastRow="0" w:firstColumn="1" w:lastColumn="0" w:oddVBand="0" w:evenVBand="0" w:oddHBand="0" w:evenHBand="0" w:firstRowFirstColumn="0" w:firstRowLastColumn="0" w:lastRowFirstColumn="0" w:lastRowLastColumn="0"/>
-            <w:tcBorders/>
-          </w:tcPr>
-          <w:p>
-            <w:pPr>
-              <w:pStyle w:val="Normal"/>
-              <w:widowControl/>
-              <w:spacing w:before="0" w:after="0"/>
-              <w:jc w:val="center"/>
-              <w:rPr>
-                <w:rFonts w:ascii="Calibri" w:hAnsi="Calibri" w:cs="Calibri" w:asciiTheme="minorHAnsi" w:cstheme="minorHAnsi" w:hAnsiTheme="minorHAnsi"/>
-                <w:color w:val="000000"/>
-                <w:sz w:val="18"/>
-                <w:szCs w:val="18"/>
-              </w:rPr>
-            </w:pPr>
-            <w:r>
-              <w:rPr>
-                <w:rFonts w:eastAsia="Times New Roman" w:cs="Calibri" w:cstheme="minorHAnsi" w:ascii="Calibri" w:hAnsi="Calibri"/>
-                <w:b/>
-                <w:bCs/>
-                <w:color w:val="000000"/>
-                <w:kern w:val="0"/>
-                <w:sz w:val="18"/>
-                <w:szCs w:val="18"/>
-                <w:lang w:val="pt-BR" w:eastAsia="pt-BR" w:bidi="ar-SA"/>
-              </w:rPr>
-            </w:r>
-          </w:p>
-        </w:tc>
-        <w:tc>
-          <w:tcPr>
-            <w:tcW w:w="2835" w:type="dxa"/>
-            <w:tcBorders/>
-          </w:tcPr>
-          <w:p>
-            <w:pPr>
-              <w:pStyle w:val="Normal"/>
-              <w:widowControl/>
-              <w:spacing w:before="0" w:after="0"/>
-              <w:jc w:val="center"/>
-              <w:cnfStyle w:val="000000000000" w:firstRow="0" w:lastRow="0" w:firstColumn="0" w:lastColumn="0" w:oddVBand="0" w:evenVBand="0" w:oddHBand="0" w:evenHBand="0" w:firstRowFirstColumn="0" w:firstRowLastColumn="0" w:lastRowFirstColumn="0" w:lastRowLastColumn="0"/>
-              <w:rPr>
-                <w:rFonts w:ascii="Calibri" w:hAnsi="Calibri" w:cs="Calibri" w:asciiTheme="minorHAnsi" w:cstheme="minorHAnsi" w:hAnsiTheme="minorHAnsi"/>
-                <w:color w:val="000000"/>
-                <w:sz w:val="18"/>
-                <w:szCs w:val="18"/>
-              </w:rPr>
-            </w:pPr>
-            <w:r>
-              <w:rPr>
-                <w:rFonts w:eastAsia="Times New Roman" w:cs="Calibri" w:cstheme="minorHAnsi" w:ascii="Calibri" w:hAnsi="Calibri"/>
-                <w:color w:val="000000"/>
-                <w:kern w:val="0"/>
-                <w:sz w:val="18"/>
-                <w:szCs w:val="18"/>
-                <w:lang w:val="pt-BR" w:eastAsia="pt-BR" w:bidi="ar-SA"/>
-              </w:rPr>
-            </w:r>
-          </w:p>
-        </w:tc>
-      </w:tr>
-      <w:tr>
-        <w:trPr>
-          <w:trHeight w:val="288" w:hRule="atLeast"/>
-        </w:trPr>
-        <w:tc>
-          <w:tcPr>
-            <w:tcW w:w="2546" w:type="dxa"/>
-            <w:cnfStyle w:val="001000000000" w:firstRow="0" w:lastRow="0" w:firstColumn="1" w:lastColumn="0" w:oddVBand="0" w:evenVBand="0" w:oddHBand="0" w:evenHBand="0" w:firstRowFirstColumn="0" w:firstRowLastColumn="0" w:lastRowFirstColumn="0" w:lastRowLastColumn="0"/>
-            <w:tcBorders/>
-          </w:tcPr>
-          <w:p>
-            <w:pPr>
-              <w:pStyle w:val="Normal"/>
-              <w:widowControl/>
-              <w:spacing w:before="0" w:after="0"/>
-              <w:jc w:val="center"/>
-              <w:rPr>
-                <w:rFonts w:ascii="Calibri" w:hAnsi="Calibri" w:cs="Calibri" w:asciiTheme="minorHAnsi" w:cstheme="minorHAnsi" w:hAnsiTheme="minorHAnsi"/>
-                <w:color w:val="000000"/>
-                <w:sz w:val="18"/>
-                <w:szCs w:val="18"/>
-              </w:rPr>
-            </w:pPr>
-            <w:r>
-              <w:rPr>
-                <w:rFonts w:eastAsia="Times New Roman" w:cs="Calibri" w:cstheme="minorHAnsi" w:ascii="Calibri" w:hAnsi="Calibri"/>
-                <w:b/>
-                <w:bCs/>
-                <w:color w:val="000000"/>
-                <w:kern w:val="0"/>
-                <w:sz w:val="18"/>
-                <w:szCs w:val="18"/>
-                <w:lang w:val="pt-BR" w:eastAsia="pt-BR" w:bidi="ar-SA"/>
-              </w:rPr>
-            </w:r>
-          </w:p>
-        </w:tc>
-        <w:tc>
-          <w:tcPr>
-            <w:tcW w:w="2835" w:type="dxa"/>
-            <w:tcBorders/>
-          </w:tcPr>
-          <w:p>
-            <w:pPr>
-              <w:pStyle w:val="Normal"/>
-              <w:widowControl/>
-              <w:spacing w:before="0" w:after="0"/>
-              <w:jc w:val="center"/>
-              <w:cnfStyle w:val="000000000000" w:firstRow="0" w:lastRow="0" w:firstColumn="0" w:lastColumn="0" w:oddVBand="0" w:evenVBand="0" w:oddHBand="0" w:evenHBand="0" w:firstRowFirstColumn="0" w:firstRowLastColumn="0" w:lastRowFirstColumn="0" w:lastRowLastColumn="0"/>
-              <w:rPr>
-                <w:rFonts w:ascii="Calibri" w:hAnsi="Calibri" w:cs="Calibri" w:asciiTheme="minorHAnsi" w:cstheme="minorHAnsi" w:hAnsiTheme="minorHAnsi"/>
-                <w:color w:val="000000"/>
-                <w:sz w:val="18"/>
-                <w:szCs w:val="18"/>
-              </w:rPr>
-            </w:pPr>
-            <w:r>
-              <w:rPr>
-                <w:rFonts w:eastAsia="Times New Roman" w:cs="Calibri" w:cstheme="minorHAnsi" w:ascii="Calibri" w:hAnsi="Calibri"/>
-                <w:color w:val="000000"/>
-                <w:kern w:val="0"/>
-                <w:sz w:val="18"/>
-                <w:szCs w:val="18"/>
-                <w:lang w:val="pt-BR" w:eastAsia="pt-BR" w:bidi="ar-SA"/>
-              </w:rPr>
-            </w:r>
-          </w:p>
-        </w:tc>
-      </w:tr>
-      <w:tr>
-        <w:trPr>
-          <w:trHeight w:val="288" w:hRule="atLeast"/>
-        </w:trPr>
-        <w:tc>
-          <w:tcPr>
-            <w:tcW w:w="2546" w:type="dxa"/>
-            <w:cnfStyle w:val="001000000000" w:firstRow="0" w:lastRow="0" w:firstColumn="1" w:lastColumn="0" w:oddVBand="0" w:evenVBand="0" w:oddHBand="0" w:evenHBand="0" w:firstRowFirstColumn="0" w:firstRowLastColumn="0" w:lastRowFirstColumn="0" w:lastRowLastColumn="0"/>
-            <w:tcBorders/>
-          </w:tcPr>
-          <w:p>
-            <w:pPr>
-              <w:pStyle w:val="Normal"/>
-              <w:widowControl/>
-              <w:spacing w:before="0" w:after="0"/>
-              <w:jc w:val="center"/>
-              <w:rPr>
-                <w:rFonts w:ascii="Calibri" w:hAnsi="Calibri" w:cs="Calibri" w:asciiTheme="minorHAnsi" w:cstheme="minorHAnsi" w:hAnsiTheme="minorHAnsi"/>
-                <w:color w:val="000000"/>
-                <w:sz w:val="18"/>
-                <w:szCs w:val="18"/>
-              </w:rPr>
-            </w:pPr>
-            <w:r>
-              <w:rPr>
-                <w:rFonts w:eastAsia="Times New Roman" w:cs="Calibri" w:cstheme="minorHAnsi" w:ascii="Calibri" w:hAnsi="Calibri"/>
-                <w:b/>
-                <w:bCs/>
-                <w:color w:val="000000"/>
-                <w:kern w:val="0"/>
-                <w:sz w:val="18"/>
-                <w:szCs w:val="18"/>
-                <w:lang w:val="pt-BR" w:eastAsia="pt-BR" w:bidi="ar-SA"/>
-              </w:rPr>
-            </w:r>
-          </w:p>
-        </w:tc>
-        <w:tc>
-          <w:tcPr>
-            <w:tcW w:w="2835" w:type="dxa"/>
-            <w:tcBorders/>
-          </w:tcPr>
-          <w:p>
-            <w:pPr>
-              <w:pStyle w:val="Normal"/>
-              <w:widowControl/>
-              <w:spacing w:before="0" w:after="0"/>
-              <w:jc w:val="center"/>
-              <w:cnfStyle w:val="000000000000" w:firstRow="0" w:lastRow="0" w:firstColumn="0" w:lastColumn="0" w:oddVBand="0" w:evenVBand="0" w:oddHBand="0" w:evenHBand="0" w:firstRowFirstColumn="0" w:firstRowLastColumn="0" w:lastRowFirstColumn="0" w:lastRowLastColumn="0"/>
-              <w:rPr>
-                <w:rFonts w:ascii="Calibri" w:hAnsi="Calibri" w:cs="Calibri" w:asciiTheme="minorHAnsi" w:cstheme="minorHAnsi" w:hAnsiTheme="minorHAnsi"/>
-                <w:color w:val="000000"/>
-                <w:sz w:val="18"/>
-                <w:szCs w:val="18"/>
-              </w:rPr>
-            </w:pPr>
-            <w:r>
-              <w:rPr>
-                <w:rFonts w:eastAsia="Times New Roman" w:cs="Calibri" w:cstheme="minorHAnsi" w:ascii="Calibri" w:hAnsi="Calibri"/>
-                <w:color w:val="000000"/>
-                <w:kern w:val="0"/>
-                <w:sz w:val="18"/>
-                <w:szCs w:val="18"/>
-                <w:lang w:val="pt-BR" w:eastAsia="pt-BR" w:bidi="ar-SA"/>
-              </w:rPr>
-            </w:r>
-          </w:p>
-        </w:tc>
-      </w:tr>
-      <w:tr>
-        <w:trPr>
-          <w:trHeight w:val="288" w:hRule="atLeast"/>
-        </w:trPr>
-        <w:tc>
-          <w:tcPr>
-            <w:tcW w:w="2546" w:type="dxa"/>
-            <w:cnfStyle w:val="001000000000" w:firstRow="0" w:lastRow="0" w:firstColumn="1" w:lastColumn="0" w:oddVBand="0" w:evenVBand="0" w:oddHBand="0" w:evenHBand="0" w:firstRowFirstColumn="0" w:firstRowLastColumn="0" w:lastRowFirstColumn="0" w:lastRowLastColumn="0"/>
-            <w:tcBorders/>
-          </w:tcPr>
-          <w:p>
-            <w:pPr>
-              <w:pStyle w:val="Normal"/>
-              <w:widowControl/>
-              <w:spacing w:before="0" w:after="0"/>
-              <w:jc w:val="center"/>
-              <w:rPr>
-                <w:rFonts w:ascii="Calibri" w:hAnsi="Calibri" w:cs="Calibri" w:asciiTheme="minorHAnsi" w:cstheme="minorHAnsi" w:hAnsiTheme="minorHAnsi"/>
-                <w:color w:val="000000"/>
-                <w:sz w:val="18"/>
-                <w:szCs w:val="18"/>
-              </w:rPr>
-            </w:pPr>
-            <w:r>
-              <w:rPr>
-                <w:rFonts w:eastAsia="Times New Roman" w:cs="Calibri" w:cstheme="minorHAnsi" w:ascii="Calibri" w:hAnsi="Calibri"/>
-                <w:b/>
-                <w:bCs/>
-                <w:color w:val="000000"/>
-                <w:kern w:val="0"/>
-                <w:sz w:val="18"/>
-                <w:szCs w:val="18"/>
-                <w:lang w:val="pt-BR" w:eastAsia="pt-BR" w:bidi="ar-SA"/>
-              </w:rPr>
-            </w:r>
-          </w:p>
-        </w:tc>
-        <w:tc>
-          <w:tcPr>
-            <w:tcW w:w="2835" w:type="dxa"/>
-            <w:tcBorders/>
-          </w:tcPr>
-          <w:p>
-            <w:pPr>
-              <w:pStyle w:val="Normal"/>
-              <w:widowControl/>
-              <w:spacing w:before="0" w:after="0"/>
-              <w:jc w:val="center"/>
-              <w:cnfStyle w:val="000000000000" w:firstRow="0" w:lastRow="0" w:firstColumn="0" w:lastColumn="0" w:oddVBand="0" w:evenVBand="0" w:oddHBand="0" w:evenHBand="0" w:firstRowFirstColumn="0" w:firstRowLastColumn="0" w:lastRowFirstColumn="0" w:lastRowLastColumn="0"/>
-              <w:rPr>
-                <w:rFonts w:ascii="Calibri" w:hAnsi="Calibri" w:cs="Calibri" w:asciiTheme="minorHAnsi" w:cstheme="minorHAnsi" w:hAnsiTheme="minorHAnsi"/>
-                <w:color w:val="000000"/>
-                <w:sz w:val="18"/>
-                <w:szCs w:val="18"/>
-              </w:rPr>
-            </w:pPr>
-            <w:r>
-              <w:rPr>
-                <w:rFonts w:eastAsia="Times New Roman" w:cs="Calibri" w:cstheme="minorHAnsi" w:ascii="Calibri" w:hAnsi="Calibri"/>
-                <w:color w:val="000000"/>
-                <w:kern w:val="0"/>
-                <w:sz w:val="18"/>
-                <w:szCs w:val="18"/>
-                <w:lang w:val="pt-BR" w:eastAsia="pt-BR" w:bidi="ar-SA"/>
-              </w:rPr>
-            </w:r>
-          </w:p>
-        </w:tc>
-      </w:tr>
-      <w:tr>
-        <w:trPr>
-          <w:trHeight w:val="288" w:hRule="atLeast"/>
-        </w:trPr>
-        <w:tc>
-          <w:tcPr>
-            <w:tcW w:w="2546" w:type="dxa"/>
-            <w:cnfStyle w:val="001000000000" w:firstRow="0" w:lastRow="0" w:firstColumn="1" w:lastColumn="0" w:oddVBand="0" w:evenVBand="0" w:oddHBand="0" w:evenHBand="0" w:firstRowFirstColumn="0" w:firstRowLastColumn="0" w:lastRowFirstColumn="0" w:lastRowLastColumn="0"/>
-            <w:tcBorders/>
-          </w:tcPr>
-          <w:p>
-            <w:pPr>
-              <w:pStyle w:val="Normal"/>
-              <w:widowControl/>
-              <w:spacing w:before="0" w:after="0"/>
-              <w:jc w:val="center"/>
-              <w:rPr>
-                <w:rFonts w:ascii="Calibri" w:hAnsi="Calibri" w:cs="Calibri" w:asciiTheme="minorHAnsi" w:cstheme="minorHAnsi" w:hAnsiTheme="minorHAnsi"/>
-                <w:color w:val="000000"/>
-                <w:sz w:val="18"/>
-                <w:szCs w:val="18"/>
-              </w:rPr>
-            </w:pPr>
-            <w:r>
-              <w:rPr>
-                <w:rFonts w:eastAsia="Times New Roman" w:cs="Calibri" w:cstheme="minorHAnsi" w:ascii="Calibri" w:hAnsi="Calibri"/>
-                <w:b/>
-                <w:bCs/>
-                <w:color w:val="000000"/>
-                <w:kern w:val="0"/>
-                <w:sz w:val="18"/>
-                <w:szCs w:val="18"/>
-                <w:lang w:val="pt-BR" w:eastAsia="pt-BR" w:bidi="ar-SA"/>
-              </w:rPr>
-            </w:r>
-          </w:p>
-        </w:tc>
-        <w:tc>
-          <w:tcPr>
-            <w:tcW w:w="2835" w:type="dxa"/>
-            <w:tcBorders/>
-          </w:tcPr>
-          <w:p>
-            <w:pPr>
-              <w:pStyle w:val="Normal"/>
-              <w:widowControl/>
-              <w:spacing w:before="0" w:after="0"/>
-              <w:jc w:val="center"/>
-              <w:cnfStyle w:val="000000000000" w:firstRow="0" w:lastRow="0" w:firstColumn="0" w:lastColumn="0" w:oddVBand="0" w:evenVBand="0" w:oddHBand="0" w:evenHBand="0" w:firstRowFirstColumn="0" w:firstRowLastColumn="0" w:lastRowFirstColumn="0" w:lastRowLastColumn="0"/>
-              <w:rPr>
-                <w:rFonts w:ascii="Calibri" w:hAnsi="Calibri" w:cs="Calibri" w:asciiTheme="minorHAnsi" w:cstheme="minorHAnsi" w:hAnsiTheme="minorHAnsi"/>
-                <w:color w:val="000000"/>
-                <w:sz w:val="18"/>
-                <w:szCs w:val="18"/>
-              </w:rPr>
-            </w:pPr>
-            <w:r>
-              <w:rPr>
-                <w:rFonts w:eastAsia="Times New Roman" w:cs="Calibri" w:cstheme="minorHAnsi" w:ascii="Calibri" w:hAnsi="Calibri"/>
-                <w:color w:val="000000"/>
-                <w:kern w:val="0"/>
-                <w:sz w:val="18"/>
-                <w:szCs w:val="18"/>
-                <w:lang w:val="pt-BR" w:eastAsia="pt-BR" w:bidi="ar-SA"/>
-              </w:rPr>
-            </w:r>
-          </w:p>
-        </w:tc>
-      </w:tr>
-      <w:tr>
-        <w:trPr>
-          <w:trHeight w:val="288" w:hRule="atLeast"/>
-        </w:trPr>
-        <w:tc>
-          <w:tcPr>
-            <w:tcW w:w="2546" w:type="dxa"/>
-            <w:cnfStyle w:val="001000000000" w:firstRow="0" w:lastRow="0" w:firstColumn="1" w:lastColumn="0" w:oddVBand="0" w:evenVBand="0" w:oddHBand="0" w:evenHBand="0" w:firstRowFirstColumn="0" w:firstRowLastColumn="0" w:lastRowFirstColumn="0" w:lastRowLastColumn="0"/>
-            <w:tcBorders/>
-          </w:tcPr>
-          <w:p>
-            <w:pPr>
-              <w:pStyle w:val="Normal"/>
-              <w:widowControl/>
-              <w:spacing w:before="0" w:after="0"/>
-              <w:jc w:val="center"/>
-              <w:rPr>
-                <w:rFonts w:ascii="Calibri" w:hAnsi="Calibri" w:cs="Calibri" w:asciiTheme="minorHAnsi" w:cstheme="minorHAnsi" w:hAnsiTheme="minorHAnsi"/>
-                <w:color w:val="000000"/>
-                <w:sz w:val="18"/>
-                <w:szCs w:val="18"/>
-              </w:rPr>
-            </w:pPr>
-            <w:r>
-              <w:rPr>
-                <w:rFonts w:eastAsia="Times New Roman" w:cs="Calibri" w:cstheme="minorHAnsi" w:ascii="Calibri" w:hAnsi="Calibri"/>
-                <w:b/>
-                <w:bCs/>
-                <w:color w:val="000000"/>
-                <w:kern w:val="0"/>
-                <w:sz w:val="18"/>
-                <w:szCs w:val="18"/>
-                <w:lang w:val="pt-BR" w:eastAsia="pt-BR" w:bidi="ar-SA"/>
-              </w:rPr>
-            </w:r>
-          </w:p>
-        </w:tc>
-        <w:tc>
-          <w:tcPr>
-            <w:tcW w:w="2835" w:type="dxa"/>
-            <w:tcBorders/>
-          </w:tcPr>
-          <w:p>
-            <w:pPr>
-              <w:pStyle w:val="Normal"/>
-              <w:widowControl/>
-              <w:spacing w:before="0" w:after="0"/>
-              <w:jc w:val="center"/>
-              <w:cnfStyle w:val="000000000000" w:firstRow="0" w:lastRow="0" w:firstColumn="0" w:lastColumn="0" w:oddVBand="0" w:evenVBand="0" w:oddHBand="0" w:evenHBand="0" w:firstRowFirstColumn="0" w:firstRowLastColumn="0" w:lastRowFirstColumn="0" w:lastRowLastColumn="0"/>
-              <w:rPr>
-                <w:rFonts w:ascii="Calibri" w:hAnsi="Calibri" w:cs="Calibri" w:asciiTheme="minorHAnsi" w:cstheme="minorHAnsi" w:hAnsiTheme="minorHAnsi"/>
-                <w:color w:val="000000"/>
-                <w:sz w:val="18"/>
-                <w:szCs w:val="18"/>
-              </w:rPr>
-            </w:pPr>
-            <w:r>
-              <w:rPr>
-                <w:rFonts w:eastAsia="Times New Roman" w:cs="Calibri" w:cstheme="minorHAnsi" w:ascii="Calibri" w:hAnsi="Calibri"/>
-                <w:color w:val="000000"/>
-                <w:kern w:val="0"/>
-                <w:sz w:val="18"/>
-                <w:szCs w:val="18"/>
-                <w:lang w:val="pt-BR" w:eastAsia="pt-BR" w:bidi="ar-SA"/>
-              </w:rPr>
-            </w:r>
-          </w:p>
-        </w:tc>
-      </w:tr>
-      <w:tr>
-        <w:trPr>
-          <w:trHeight w:val="288" w:hRule="atLeast"/>
-        </w:trPr>
-        <w:tc>
-          <w:tcPr>
-            <w:tcW w:w="2546" w:type="dxa"/>
-            <w:cnfStyle w:val="001000000000" w:firstRow="0" w:lastRow="0" w:firstColumn="1" w:lastColumn="0" w:oddVBand="0" w:evenVBand="0" w:oddHBand="0" w:evenHBand="0" w:firstRowFirstColumn="0" w:firstRowLastColumn="0" w:lastRowFirstColumn="0" w:lastRowLastColumn="0"/>
-            <w:tcBorders/>
-          </w:tcPr>
-          <w:p>
-            <w:pPr>
-              <w:pStyle w:val="Normal"/>
-              <w:widowControl/>
-              <w:spacing w:before="0" w:after="0"/>
-              <w:jc w:val="center"/>
-              <w:rPr>
-                <w:rFonts w:ascii="Calibri" w:hAnsi="Calibri" w:cs="Calibri" w:asciiTheme="minorHAnsi" w:cstheme="minorHAnsi" w:hAnsiTheme="minorHAnsi"/>
-                <w:color w:val="000000"/>
-                <w:sz w:val="18"/>
-                <w:szCs w:val="18"/>
-              </w:rPr>
-            </w:pPr>
-            <w:r>
-              <w:rPr>
-                <w:rFonts w:eastAsia="Times New Roman" w:cs="Calibri" w:cstheme="minorHAnsi" w:ascii="Calibri" w:hAnsi="Calibri"/>
-                <w:b/>
-                <w:bCs/>
-                <w:color w:val="000000"/>
-                <w:kern w:val="0"/>
-                <w:sz w:val="18"/>
-                <w:szCs w:val="18"/>
-                <w:lang w:val="pt-BR" w:eastAsia="pt-BR" w:bidi="ar-SA"/>
-              </w:rPr>
-            </w:r>
-          </w:p>
-        </w:tc>
-        <w:tc>
-          <w:tcPr>
-            <w:tcW w:w="2835" w:type="dxa"/>
-            <w:tcBorders/>
-          </w:tcPr>
-          <w:p>
-            <w:pPr>
-              <w:pStyle w:val="Normal"/>
-              <w:widowControl/>
-              <w:spacing w:before="0" w:after="0"/>
-              <w:jc w:val="center"/>
-              <w:cnfStyle w:val="000000000000" w:firstRow="0" w:lastRow="0" w:firstColumn="0" w:lastColumn="0" w:oddVBand="0" w:evenVBand="0" w:oddHBand="0" w:evenHBand="0" w:firstRowFirstColumn="0" w:firstRowLastColumn="0" w:lastRowFirstColumn="0" w:lastRowLastColumn="0"/>
-              <w:rPr>
-                <w:rFonts w:ascii="Calibri" w:hAnsi="Calibri" w:cs="Calibri" w:asciiTheme="minorHAnsi" w:cstheme="minorHAnsi" w:hAnsiTheme="minorHAnsi"/>
-                <w:color w:val="000000"/>
-                <w:sz w:val="18"/>
-                <w:szCs w:val="18"/>
-              </w:rPr>
-            </w:pPr>
-            <w:r>
-              <w:rPr>
-                <w:rFonts w:eastAsia="Times New Roman" w:cs="Calibri" w:cstheme="minorHAnsi" w:ascii="Calibri" w:hAnsi="Calibri"/>
-                <w:color w:val="000000"/>
-                <w:kern w:val="0"/>
-                <w:sz w:val="18"/>
-                <w:szCs w:val="18"/>
-                <w:lang w:val="pt-BR" w:eastAsia="pt-BR" w:bidi="ar-SA"/>
-              </w:rPr>
-            </w:r>
-          </w:p>
-        </w:tc>
-      </w:tr>
-      <w:tr>
-        <w:trPr>
-          <w:trHeight w:val="288" w:hRule="atLeast"/>
-        </w:trPr>
-        <w:tc>
-          <w:tcPr>
-            <w:tcW w:w="2546" w:type="dxa"/>
-            <w:cnfStyle w:val="001000000000" w:firstRow="0" w:lastRow="0" w:firstColumn="1" w:lastColumn="0" w:oddVBand="0" w:evenVBand="0" w:oddHBand="0" w:evenHBand="0" w:firstRowFirstColumn="0" w:firstRowLastColumn="0" w:lastRowFirstColumn="0" w:lastRowLastColumn="0"/>
-            <w:tcBorders/>
-          </w:tcPr>
-          <w:p>
-            <w:pPr>
-              <w:pStyle w:val="Normal"/>
-              <w:widowControl/>
-              <w:spacing w:before="0" w:after="0"/>
-              <w:jc w:val="center"/>
-              <w:rPr>
-                <w:rFonts w:ascii="Calibri" w:hAnsi="Calibri" w:cs="Calibri" w:asciiTheme="minorHAnsi" w:cstheme="minorHAnsi" w:hAnsiTheme="minorHAnsi"/>
-                <w:color w:val="000000"/>
-                <w:sz w:val="18"/>
-                <w:szCs w:val="18"/>
-              </w:rPr>
-            </w:pPr>
-            <w:r>
-              <w:rPr>
-                <w:rFonts w:eastAsia="Times New Roman" w:cs="Calibri" w:cstheme="minorHAnsi" w:ascii="Calibri" w:hAnsi="Calibri"/>
-                <w:b/>
-                <w:bCs/>
-                <w:color w:val="000000"/>
-                <w:kern w:val="0"/>
-                <w:sz w:val="18"/>
-                <w:szCs w:val="18"/>
-                <w:lang w:val="pt-BR" w:eastAsia="pt-BR" w:bidi="ar-SA"/>
-              </w:rPr>
-            </w:r>
-          </w:p>
-        </w:tc>
-        <w:tc>
-          <w:tcPr>
-            <w:tcW w:w="2835" w:type="dxa"/>
-            <w:tcBorders/>
-          </w:tcPr>
-          <w:p>
-            <w:pPr>
-              <w:pStyle w:val="Normal"/>
-              <w:widowControl/>
-              <w:spacing w:before="0" w:after="0"/>
-              <w:jc w:val="center"/>
-              <w:cnfStyle w:val="000000000000" w:firstRow="0" w:lastRow="0" w:firstColumn="0" w:lastColumn="0" w:oddVBand="0" w:evenVBand="0" w:oddHBand="0" w:evenHBand="0" w:firstRowFirstColumn="0" w:firstRowLastColumn="0" w:lastRowFirstColumn="0" w:lastRowLastColumn="0"/>
-              <w:rPr>
-                <w:rFonts w:ascii="Calibri" w:hAnsi="Calibri" w:cs="Calibri" w:asciiTheme="minorHAnsi" w:cstheme="minorHAnsi" w:hAnsiTheme="minorHAnsi"/>
-                <w:color w:val="000000"/>
-                <w:sz w:val="18"/>
-                <w:szCs w:val="18"/>
-              </w:rPr>
-            </w:pPr>
-            <w:r>
-              <w:rPr>
-                <w:rFonts w:eastAsia="Times New Roman" w:cs="Calibri" w:cstheme="minorHAnsi" w:ascii="Calibri" w:hAnsi="Calibri"/>
-                <w:color w:val="000000"/>
-                <w:kern w:val="0"/>
-                <w:sz w:val="18"/>
-                <w:szCs w:val="18"/>
-                <w:lang w:val="pt-BR" w:eastAsia="pt-BR" w:bidi="ar-SA"/>
-              </w:rPr>
-            </w:r>
-          </w:p>
-        </w:tc>
-      </w:tr>
-      <w:tr>
-        <w:trPr>
-          <w:trHeight w:val="288" w:hRule="atLeast"/>
-        </w:trPr>
-        <w:tc>
-          <w:tcPr>
-            <w:tcW w:w="2546" w:type="dxa"/>
-            <w:cnfStyle w:val="001000000000" w:firstRow="0" w:lastRow="0" w:firstColumn="1" w:lastColumn="0" w:oddVBand="0" w:evenVBand="0" w:oddHBand="0" w:evenHBand="0" w:firstRowFirstColumn="0" w:firstRowLastColumn="0" w:lastRowFirstColumn="0" w:lastRowLastColumn="0"/>
-            <w:tcBorders/>
-          </w:tcPr>
-          <w:p>
-            <w:pPr>
-              <w:pStyle w:val="Normal"/>
-              <w:widowControl/>
-              <w:spacing w:before="0" w:after="0"/>
-              <w:jc w:val="center"/>
-              <w:rPr>
-                <w:rFonts w:ascii="Calibri" w:hAnsi="Calibri" w:cs="Calibri" w:asciiTheme="minorHAnsi" w:cstheme="minorHAnsi" w:hAnsiTheme="minorHAnsi"/>
-                <w:color w:val="000000"/>
-                <w:sz w:val="18"/>
-                <w:szCs w:val="18"/>
-              </w:rPr>
-            </w:pPr>
-            <w:r>
-              <w:rPr>
-                <w:rFonts w:eastAsia="Times New Roman" w:cs="Calibri" w:cstheme="minorHAnsi" w:ascii="Calibri" w:hAnsi="Calibri"/>
-                <w:b/>
-                <w:bCs/>
-                <w:color w:val="000000"/>
-                <w:kern w:val="0"/>
-                <w:sz w:val="18"/>
-                <w:szCs w:val="18"/>
-                <w:lang w:val="pt-BR" w:eastAsia="pt-BR" w:bidi="ar-SA"/>
-              </w:rPr>
-            </w:r>
-          </w:p>
-        </w:tc>
-        <w:tc>
-          <w:tcPr>
-            <w:tcW w:w="2835" w:type="dxa"/>
-            <w:tcBorders/>
-          </w:tcPr>
-          <w:p>
-            <w:pPr>
-              <w:pStyle w:val="Normal"/>
-              <w:widowControl/>
-              <w:spacing w:before="0" w:after="0"/>
-              <w:jc w:val="center"/>
-              <w:cnfStyle w:val="000000000000" w:firstRow="0" w:lastRow="0" w:firstColumn="0" w:lastColumn="0" w:oddVBand="0" w:evenVBand="0" w:oddHBand="0" w:evenHBand="0" w:firstRowFirstColumn="0" w:firstRowLastColumn="0" w:lastRowFirstColumn="0" w:lastRowLastColumn="0"/>
-              <w:rPr>
-                <w:rFonts w:ascii="Calibri" w:hAnsi="Calibri" w:cs="Calibri" w:asciiTheme="minorHAnsi" w:cstheme="minorHAnsi" w:hAnsiTheme="minorHAnsi"/>
-                <w:color w:val="000000"/>
-                <w:sz w:val="18"/>
-                <w:szCs w:val="18"/>
-              </w:rPr>
-            </w:pPr>
-            <w:r>
-              <w:rPr>
-                <w:rFonts w:eastAsia="Times New Roman" w:cs="Calibri" w:cstheme="minorHAnsi" w:ascii="Calibri" w:hAnsi="Calibri"/>
-                <w:color w:val="000000"/>
-                <w:kern w:val="0"/>
-                <w:sz w:val="18"/>
-                <w:szCs w:val="18"/>
-                <w:lang w:val="pt-BR" w:eastAsia="pt-BR" w:bidi="ar-SA"/>
-              </w:rPr>
-            </w:r>
-          </w:p>
-        </w:tc>
-      </w:tr>
-    </w:tbl>
-    <w:p>
-      <w:pPr>
-        <w:pStyle w:val="Normal"/>
-        <w:tabs>
-          <w:tab w:val="clear" w:pos="708"/>
-          <w:tab w:val="left" w:pos="284" w:leader="none"/>
-        </w:tabs>
-        <w:jc w:val="both"/>
-        <w:rPr>
-          <w:rFonts w:ascii="Calibri" w:hAnsi="Calibri" w:cs="Calibri" w:asciiTheme="minorHAnsi" w:cstheme="minorHAnsi" w:hAnsiTheme="minorHAnsi"/>
-          <w:sz w:val="14"/>
-          <w:szCs w:val="14"/>
         </w:rPr>
       </w:pPr>
       <w:r>
@@ -10086,12 +9133,10 @@
     </w:pPr>
     <w:r>
       <w:rPr/>
-    </w:r>
-    <w:r>
       <mc:AlternateContent>
         <mc:Choice Requires="wps">
           <w:drawing>
-            <wp:anchor behindDoc="0" distT="0" distB="0" distL="0" distR="0" simplePos="0" locked="0" layoutInCell="1" allowOverlap="1" relativeHeight="0">
+            <wp:anchor behindDoc="1" distT="0" distB="0" distL="0" distR="0" simplePos="0" locked="0" layoutInCell="0" allowOverlap="1" relativeHeight="9">
               <wp:simplePos x="0" y="0"/>
               <wp:positionH relativeFrom="margin">
                 <wp:align>right</wp:align>
@@ -10106,25 +9151,31 @@
               <a:graphic xmlns:a="http://schemas.openxmlformats.org/drawingml/2006/main">
                 <a:graphicData uri="http://schemas.microsoft.com/office/word/2010/wordprocessingShape">
                   <wps:wsp>
-                    <wps:cNvSpPr txBox="1"/>
+                    <wps:cNvSpPr/>
                     <wps:spPr>
                       <a:xfrm>
                         <a:off x="0" y="0"/>
-                        <a:ext cx="14605" cy="14605"/>
+                        <a:ext cx="14760" cy="14760"/>
                       </a:xfrm>
-                      <a:prstGeom prst="rect"/>
-                      <a:solidFill>
-                        <a:srgbClr val="FFFFFF">
-                          <a:alpha val="0"/>
-                        </a:srgbClr>
-                      </a:solidFill>
+                      <a:prstGeom prst="rect">
+                        <a:avLst/>
+                      </a:prstGeom>
+                      <a:noFill/>
+                      <a:ln w="0">
+                        <a:noFill/>
+                      </a:ln>
                     </wps:spPr>
+                    <wps:style>
+                      <a:lnRef idx="0"/>
+                      <a:fillRef idx="0"/>
+                      <a:effectRef idx="0"/>
+                      <a:fontRef idx="minor"/>
+                    </wps:style>
                     <wps:txbx>
                       <w:txbxContent>
                         <w:p>
                           <w:pPr>
                             <w:pStyle w:val="Footer"/>
-                            <w:pBdr/>
                             <w:rPr>
                               <w:rStyle w:val="PageNumber"/>
                             </w:rPr>
@@ -10162,7 +9213,7 @@
                         </w:p>
                       </w:txbxContent>
                     </wps:txbx>
-                    <wps:bodyPr anchor="t" lIns="0" tIns="0" rIns="0" bIns="0">
+                    <wps:bodyPr lIns="0" rIns="0" tIns="0" bIns="0" anchor="t">
                       <a:spAutoFit/>
                     </wps:bodyPr>
                   </wps:wsp>
@@ -10173,14 +9224,14 @@
         </mc:Choice>
         <mc:Fallback>
           <w:pict>
-            <v:rect fillcolor="#FFFFFF" style="position:absolute;rotation:-0;width:1.15pt;height:1.15pt;mso-wrap-distance-left:0pt;mso-wrap-distance-right:0pt;mso-wrap-distance-top:0pt;mso-wrap-distance-bottom:0pt;margin-top:0.05pt;mso-position-vertical-relative:text;margin-left:0pt;mso-position-horizontal:right;mso-position-horizontal-relative:margin">
-              <v:fill opacity="0f"/>
-              <v:textbox inset="0in,0in,0in,0in">
+            <v:rect id="shape_0" ID="Quadro2" path="m0,0l-2147483645,0l-2147483645,-2147483646l0,-2147483646xe" fillcolor="white" stroked="f" o:allowincell="f" style="position:absolute;margin-left:0pt;margin-top:0.05pt;width:1.1pt;height:1.1pt;mso-wrap-style:square;v-text-anchor:top;mso-position-horizontal:right;mso-position-horizontal-relative:margin">
+              <v:fill o:detectmouseclick="t" type="solid" color2="black" opacity="0"/>
+              <v:stroke color="#3465a4" joinstyle="round" endcap="flat"/>
+              <v:textbox>
                 <w:txbxContent>
                   <w:p>
                     <w:pPr>
                       <w:pStyle w:val="Footer"/>
-                      <w:pBdr/>
                       <w:rPr>
                         <w:rStyle w:val="PageNumber"/>
                       </w:rPr>
@@ -10551,12 +9602,10 @@
     </w:pPr>
     <w:r>
       <w:rPr/>
-    </w:r>
-    <w:r>
       <mc:AlternateContent>
         <mc:Choice Requires="wps">
           <w:drawing>
-            <wp:anchor behindDoc="0" distT="0" distB="0" distL="0" distR="0" simplePos="0" locked="0" layoutInCell="1" allowOverlap="1" relativeHeight="0">
+            <wp:anchor behindDoc="1" distT="0" distB="0" distL="0" distR="0" simplePos="0" locked="0" layoutInCell="0" allowOverlap="1" relativeHeight="8">
               <wp:simplePos x="0" y="0"/>
               <wp:positionH relativeFrom="margin">
                 <wp:align>right</wp:align>
@@ -10571,25 +9620,31 @@
               <a:graphic xmlns:a="http://schemas.openxmlformats.org/drawingml/2006/main">
                 <a:graphicData uri="http://schemas.microsoft.com/office/word/2010/wordprocessingShape">
                   <wps:wsp>
-                    <wps:cNvSpPr txBox="1"/>
+                    <wps:cNvSpPr/>
                     <wps:spPr>
                       <a:xfrm>
                         <a:off x="0" y="0"/>
-                        <a:ext cx="14605" cy="14605"/>
+                        <a:ext cx="14760" cy="14760"/>
                       </a:xfrm>
-                      <a:prstGeom prst="rect"/>
-                      <a:solidFill>
-                        <a:srgbClr val="FFFFFF">
-                          <a:alpha val="0"/>
-                        </a:srgbClr>
-                      </a:solidFill>
+                      <a:prstGeom prst="rect">
+                        <a:avLst/>
+                      </a:prstGeom>
+                      <a:noFill/>
+                      <a:ln w="0">
+                        <a:noFill/>
+                      </a:ln>
                     </wps:spPr>
+                    <wps:style>
+                      <a:lnRef idx="0"/>
+                      <a:fillRef idx="0"/>
+                      <a:effectRef idx="0"/>
+                      <a:fontRef idx="minor"/>
+                    </wps:style>
                     <wps:txbx>
                       <w:txbxContent>
                         <w:p>
                           <w:pPr>
                             <w:pStyle w:val="Header"/>
-                            <w:pBdr/>
                             <w:rPr>
                               <w:rStyle w:val="PageNumber"/>
                             </w:rPr>
@@ -10627,7 +9682,7 @@
                         </w:p>
                       </w:txbxContent>
                     </wps:txbx>
-                    <wps:bodyPr anchor="t" lIns="0" tIns="0" rIns="0" bIns="0">
+                    <wps:bodyPr lIns="0" rIns="0" tIns="0" bIns="0" anchor="t">
                       <a:spAutoFit/>
                     </wps:bodyPr>
                   </wps:wsp>
@@ -10638,14 +9693,14 @@
         </mc:Choice>
         <mc:Fallback>
           <w:pict>
-            <v:rect fillcolor="#FFFFFF" style="position:absolute;rotation:-0;width:1.15pt;height:1.15pt;mso-wrap-distance-left:0pt;mso-wrap-distance-right:0pt;mso-wrap-distance-top:0pt;mso-wrap-distance-bottom:0pt;margin-top:0.05pt;mso-position-vertical-relative:text;margin-left:0pt;mso-position-horizontal:right;mso-position-horizontal-relative:margin">
-              <v:fill opacity="0f"/>
-              <v:textbox inset="0in,0in,0in,0in">
+            <v:rect id="shape_0" ID="Quadro1" path="m0,0l-2147483645,0l-2147483645,-2147483646l0,-2147483646xe" fillcolor="white" stroked="f" o:allowincell="f" style="position:absolute;margin-left:0pt;margin-top:0.05pt;width:1.1pt;height:1.1pt;mso-wrap-style:square;v-text-anchor:top;mso-position-horizontal:right;mso-position-horizontal-relative:margin">
+              <v:fill o:detectmouseclick="t" type="solid" color2="black" opacity="0"/>
+              <v:stroke color="#3465a4" joinstyle="round" endcap="flat"/>
+              <v:textbox>
                 <w:txbxContent>
                   <w:p>
                     <w:pPr>
                       <w:pStyle w:val="Header"/>
-                      <w:pBdr/>
                       <w:rPr>
                         <w:rStyle w:val="PageNumber"/>
                       </w:rPr>
@@ -11846,6 +10901,7 @@
     <w:rsid w:val="00ab5ab9"/>
     <w:pPr>
       <w:widowControl/>
+      <w:suppressAutoHyphens w:val="true"/>
       <w:bidi w:val="0"/>
       <w:spacing w:before="0" w:after="0"/>
       <w:jc w:val="left"/>
@@ -12048,6 +11104,13 @@
   </w:style>
   <w:style w:type="character" w:styleId="FootnoteCharacters">
     <w:name w:val="Footnote Characters"/>
+    <w:qFormat/>
+    <w:rPr>
+      <w:vertAlign w:val="superscript"/>
+    </w:rPr>
+  </w:style>
+  <w:style w:type="character" w:styleId="FootnoteCharacters1">
+    <w:name w:val="Footnote Characters1"/>
     <w:basedOn w:val="DefaultParagraphFont"/>
     <w:uiPriority w:val="99"/>
     <w:semiHidden/>
@@ -12105,6 +11168,14 @@
     <w:qFormat/>
     <w:rsid w:val="004a28fe"/>
     <w:rPr/>
+  </w:style>
+  <w:style w:type="character" w:styleId="InternetLink1">
+    <w:name w:val="Internet Link1"/>
+    <w:qFormat/>
+    <w:rPr>
+      <w:color w:val="000080"/>
+      <w:u w:val="single"/>
+    </w:rPr>
   </w:style>
   <w:style w:type="character" w:styleId="Hyperlink">
     <w:name w:val="Hyperlink"/>
@@ -12287,6 +11358,7 @@
     <w:qFormat/>
     <w:pPr>
       <w:widowControl/>
+      <w:suppressAutoHyphens w:val="true"/>
       <w:bidi w:val="0"/>
       <w:spacing w:before="0" w:after="0"/>
       <w:jc w:val="left"/>

</xml_diff>